<commit_message>
Update covers for final print
</commit_message>
<xml_diff>
--- a/assets/back-cover-A5.docx
+++ b/assets/back-cover-A5.docx
@@ -15,6 +15,71 @@
           <w:lang w:val="en-US"/>
         </w:rPr>
       </w:pPr>
+      <w:r>
+        <w:rPr>
+          <w:rFonts w:ascii="Times New Roman" w:hAnsi="Times New Roman" w:cs="Times New Roman"/>
+          <w:noProof/>
+          <w:color w:val="153D63" w:themeColor="text2" w:themeTint="E6"/>
+          <w:sz w:val="56"/>
+          <w:szCs w:val="56"/>
+          <w:lang w:val="en-US"/>
+        </w:rPr>
+        <w:drawing>
+          <wp:anchor distT="0" distB="0" distL="114300" distR="114300" simplePos="0" relativeHeight="251659264" behindDoc="1" locked="0" layoutInCell="1" allowOverlap="1" wp14:anchorId="73E06A73" wp14:editId="653EA0C0">
+            <wp:simplePos x="0" y="0"/>
+            <wp:positionH relativeFrom="column">
+              <wp:posOffset>-123271</wp:posOffset>
+            </wp:positionH>
+            <wp:positionV relativeFrom="paragraph">
+              <wp:posOffset>-1402601</wp:posOffset>
+            </wp:positionV>
+            <wp:extent cx="6145867" cy="9832719"/>
+            <wp:effectExtent l="2438400" t="838200" r="2426970" b="835660"/>
+            <wp:wrapNone/>
+            <wp:docPr id="2107634486" name="Picture 1"/>
+            <wp:cNvGraphicFramePr>
+              <a:graphicFrameLocks xmlns:a="http://schemas.openxmlformats.org/drawingml/2006/main" noChangeAspect="1"/>
+            </wp:cNvGraphicFramePr>
+            <a:graphic xmlns:a="http://schemas.openxmlformats.org/drawingml/2006/main">
+              <a:graphicData uri="http://schemas.openxmlformats.org/drawingml/2006/picture">
+                <pic:pic xmlns:pic="http://schemas.openxmlformats.org/drawingml/2006/picture">
+                  <pic:nvPicPr>
+                    <pic:cNvPr id="208324177" name="Picture 208324177"/>
+                    <pic:cNvPicPr/>
+                  </pic:nvPicPr>
+                  <pic:blipFill>
+                    <a:blip r:embed="rId5">
+                      <a:extLst>
+                        <a:ext uri="{28A0092B-C50C-407E-A947-70E740481C1C}">
+                          <a14:useLocalDpi xmlns:a14="http://schemas.microsoft.com/office/drawing/2010/main" val="0"/>
+                        </a:ext>
+                      </a:extLst>
+                    </a:blip>
+                    <a:stretch>
+                      <a:fillRect/>
+                    </a:stretch>
+                  </pic:blipFill>
+                  <pic:spPr>
+                    <a:xfrm rot="2383915">
+                      <a:off x="0" y="0"/>
+                      <a:ext cx="6160010" cy="9855346"/>
+                    </a:xfrm>
+                    <a:prstGeom prst="rect">
+                      <a:avLst/>
+                    </a:prstGeom>
+                  </pic:spPr>
+                </pic:pic>
+              </a:graphicData>
+            </a:graphic>
+            <wp14:sizeRelH relativeFrom="page">
+              <wp14:pctWidth>0</wp14:pctWidth>
+            </wp14:sizeRelH>
+            <wp14:sizeRelV relativeFrom="page">
+              <wp14:pctHeight>0</wp14:pctHeight>
+            </wp14:sizeRelV>
+          </wp:anchor>
+        </w:drawing>
+      </w:r>
     </w:p>
     <w:p>
       <w:pPr>
@@ -29,6 +94,71 @@
           <w:lang w:val="en-US"/>
         </w:rPr>
       </w:pPr>
+      <w:r>
+        <w:rPr>
+          <w:rFonts w:ascii="Times New Roman" w:hAnsi="Times New Roman" w:cs="Times New Roman"/>
+          <w:noProof/>
+          <w:color w:val="153D63" w:themeColor="text2" w:themeTint="E6"/>
+          <w:sz w:val="56"/>
+          <w:szCs w:val="56"/>
+          <w:lang w:val="en-US"/>
+        </w:rPr>
+        <w:drawing>
+          <wp:anchor distT="0" distB="0" distL="114300" distR="114300" simplePos="0" relativeHeight="251658240" behindDoc="1" locked="0" layoutInCell="1" allowOverlap="1" wp14:anchorId="1A5F9FE9" wp14:editId="4DCD7E81">
+            <wp:simplePos x="0" y="0"/>
+            <wp:positionH relativeFrom="column">
+              <wp:posOffset>1553436</wp:posOffset>
+            </wp:positionH>
+            <wp:positionV relativeFrom="paragraph">
+              <wp:posOffset>159187</wp:posOffset>
+            </wp:positionV>
+            <wp:extent cx="3499485" cy="5598795"/>
+            <wp:effectExtent l="1390650" t="476250" r="1320165" b="478155"/>
+            <wp:wrapNone/>
+            <wp:docPr id="208324177" name="Picture 1"/>
+            <wp:cNvGraphicFramePr>
+              <a:graphicFrameLocks xmlns:a="http://schemas.openxmlformats.org/drawingml/2006/main" noChangeAspect="1"/>
+            </wp:cNvGraphicFramePr>
+            <a:graphic xmlns:a="http://schemas.openxmlformats.org/drawingml/2006/main">
+              <a:graphicData uri="http://schemas.openxmlformats.org/drawingml/2006/picture">
+                <pic:pic xmlns:pic="http://schemas.openxmlformats.org/drawingml/2006/picture">
+                  <pic:nvPicPr>
+                    <pic:cNvPr id="208324177" name="Picture 208324177"/>
+                    <pic:cNvPicPr/>
+                  </pic:nvPicPr>
+                  <pic:blipFill>
+                    <a:blip r:embed="rId5">
+                      <a:extLst>
+                        <a:ext uri="{28A0092B-C50C-407E-A947-70E740481C1C}">
+                          <a14:useLocalDpi xmlns:a14="http://schemas.microsoft.com/office/drawing/2010/main" val="0"/>
+                        </a:ext>
+                      </a:extLst>
+                    </a:blip>
+                    <a:stretch>
+                      <a:fillRect/>
+                    </a:stretch>
+                  </pic:blipFill>
+                  <pic:spPr>
+                    <a:xfrm rot="2383915">
+                      <a:off x="0" y="0"/>
+                      <a:ext cx="3499485" cy="5598795"/>
+                    </a:xfrm>
+                    <a:prstGeom prst="rect">
+                      <a:avLst/>
+                    </a:prstGeom>
+                  </pic:spPr>
+                </pic:pic>
+              </a:graphicData>
+            </a:graphic>
+            <wp14:sizeRelH relativeFrom="page">
+              <wp14:pctWidth>0</wp14:pctWidth>
+            </wp14:sizeRelH>
+            <wp14:sizeRelV relativeFrom="page">
+              <wp14:pctHeight>0</wp14:pctHeight>
+            </wp14:sizeRelV>
+          </wp:anchor>
+        </w:drawing>
+      </w:r>
       <w:proofErr w:type="gramStart"/>
       <w:r>
         <w:rPr>

</xml_diff>